<commit_message>
Session 2: replace non-existent course app with Zoom chat activities and Prompt Lab fallback
Co-Authored-By: Claude Opus 5.5 <noreply@anthropic.com>
Claude-Session: https://claude.ai/code/session_01KYVx18xMYxByYxo559XEXy
</commit_message>
<xml_diff>
--- a/קורס בסיסי AI/שיעור 2/מערך למרצה שיעור 2.docx
+++ b/קורס בסיסי AI/שיעור 2/מערך למרצה שיעור 2.docx
@@ -91,26 +91,6 @@
           <w:b/>
           <w:rtl/>
         </w:rPr>
-        <w:t xml:space="preserve">אפליקציית הקורס: </w:t>
-      </w:r>
-      <w:r>
-        <w:rPr>
-          <w:i w:val="0"/>
-          <w:rtl/>
-        </w:rPr>
-        <w:t>ai-quiz-live.lovable.app</w:t>
-      </w:r>
-    </w:p>
-    <w:p>
-      <w:pPr>
-        <w:bidi/>
-        <w:jc w:val="right"/>
-      </w:pPr>
-      <w:r>
-        <w:rPr>
-          <w:b/>
-          <w:rtl/>
-        </w:rPr>
         <w:t xml:space="preserve">חומרים להדבקה בצ'אט: </w:t>
       </w:r>
       <w:r>
@@ -170,7 +150,20 @@
           <w:i w:val="0"/>
           <w:rtl/>
         </w:rPr>
-        <w:t>☐ לאפס את המשחק Prompt Lab ואת אפליקציית הקורס, ולבחור בה שיעור 2</w:t>
+        <w:t>☐ יום לפני: לבדוק את Prompt Lab עם 2 עד 3 אנשים מהטלפון. רגע לפני המפגש: לאפס אותו</w:t>
+      </w:r>
+    </w:p>
+    <w:p>
+      <w:pPr>
+        <w:bidi/>
+        <w:jc w:val="right"/>
+      </w:pPr>
+      <w:r>
+        <w:rPr>
+          <w:i w:val="0"/>
+          <w:rtl/>
+        </w:rPr>
+        <w:t>☐ תוכנית גיבוי: אם Prompt Lab לא עולה, כל הפעילויות עוברות לצ'אט של הזום. הגיבוי כתוב בכל שקופית רלוונטית</w:t>
       </w:r>
     </w:p>
     <w:p>
@@ -826,14 +819,14 @@
           <w:b/>
           <w:rtl/>
         </w:rPr>
-        <w:t xml:space="preserve">אפליקציית הקורס: </w:t>
-      </w:r>
-      <w:r>
-        <w:rPr>
-          <w:i w:val="0"/>
-          <w:rtl/>
-        </w:rPr>
-        <w:t>פותחים את המשחק ומפעילים את סבב החימום הראשון.</w:t>
+        <w:t xml:space="preserve">פעילות: </w:t>
+      </w:r>
+      <w:r>
+        <w:rPr>
+          <w:i w:val="0"/>
+          <w:rtl/>
+        </w:rPr>
+        <w:t>פותחים את Prompt Lab ומפעילים את סבב החימום הראשון. גיבוי: אם המשחק לא עולה תוך דקה, ממשיכים בלי, ומבקשים בצ'אט: "כתבו את ההנחיה הכי גרועה ששלחתם פעם ל-AI".</w:t>
       </w:r>
     </w:p>
     <w:p>
@@ -2957,14 +2950,14 @@
           <w:b/>
           <w:rtl/>
         </w:rPr>
-        <w:t xml:space="preserve">אפליקציית הקורס: </w:t>
-      </w:r>
-      <w:r>
-        <w:rPr>
-          <w:i w:val="0"/>
-          <w:rtl/>
-        </w:rPr>
-        <w:t>סבב "תקנו את ההנחיה": כל הנחיה חלשה מוצגת, והמשתתפים כותבים תיקון.</w:t>
+        <w:t xml:space="preserve">פעילות: </w:t>
+      </w:r>
+      <w:r>
+        <w:rPr>
+          <w:i w:val="0"/>
+          <w:rtl/>
+        </w:rPr>
+        <w:t>סבב "תקנו את ההנחיה" בצ'אט: כל הנחיה חלשה מוצגת, והמשתתפים כותבים תיקון בצ'אט.</w:t>
       </w:r>
     </w:p>
     <w:p>
@@ -3010,7 +3003,7 @@
           <w:color w:val="7A5A00"/>
           <w:rtl/>
         </w:rPr>
-        <w:t>(לפני שחושפים את הפתרון, מציגים כל הנחיה ושואלים: מה הבעיה? כתבו בצ'אט או במשחק)</w:t>
+        <w:t>(לפני שחושפים את הפתרון, מציגים כל הנחיה ושואלים: מה הבעיה? כתבו בצ'אט)</w:t>
       </w:r>
     </w:p>
     <w:p>
@@ -3161,14 +3154,14 @@
           <w:b/>
           <w:rtl/>
         </w:rPr>
-        <w:t xml:space="preserve">אפליקציית הקורס: </w:t>
-      </w:r>
-      <w:r>
-        <w:rPr>
-          <w:i w:val="0"/>
-          <w:rtl/>
-        </w:rPr>
-        <w:t>הצבעה: איזו תוצאה ניצחה, 1 או 2.</w:t>
+        <w:t xml:space="preserve">פעילות: </w:t>
+      </w:r>
+      <w:r>
+        <w:rPr>
+          <w:i w:val="0"/>
+          <w:rtl/>
+        </w:rPr>
+        <w:t>הצבעה בצ'אט: כותבים 1 או 2.</w:t>
       </w:r>
     </w:p>
     <w:p>
@@ -3633,14 +3626,14 @@
           <w:b/>
           <w:rtl/>
         </w:rPr>
-        <w:t xml:space="preserve">אפליקציית הקורס: </w:t>
-      </w:r>
-      <w:r>
-        <w:rPr>
-          <w:i w:val="0"/>
-          <w:rtl/>
-        </w:rPr>
-        <w:t>פותחים את האתגר "מענה למייל עצבני".</w:t>
+        <w:t xml:space="preserve">פעילות: </w:t>
+      </w:r>
+      <w:r>
+        <w:rPr>
+          <w:i w:val="0"/>
+          <w:rtl/>
+        </w:rPr>
+        <w:t>אתגר בצ'אט: "מענה למייל עצבני". מקריאים 3 הנחיות מהצ'אט, והכיתה מצביעה בצ'אט: 1, 2 או 3.</w:t>
       </w:r>
     </w:p>
     <w:p>
@@ -3738,7 +3731,7 @@
           <w:i w:val="0"/>
           <w:rtl/>
         </w:rPr>
-        <w:t>ועכשיו אתגר באפליקציה: אחד המיילים לדוגמה הוא של לקוח עצבני. כתבו את ההנחיה שתוציא ממנו תשובה מושלמת. שלוש דקות.</w:t>
+        <w:t>ועכשיו אתגר: אחד המיילים לדוגמה הוא של לקוח עצבני. כתבו את ההנחיה שתוציא ממנו תשובה מושלמת, ושלחו אותה בצ'אט. שלוש דקות, ואז אקריא שלוש ונצביע.</w:t>
       </w:r>
     </w:p>
     <w:p>
@@ -4730,14 +4723,14 @@
           <w:b/>
           <w:rtl/>
         </w:rPr>
-        <w:t xml:space="preserve">אפליקציית הקורס: </w:t>
-      </w:r>
-      <w:r>
-        <w:rPr>
-          <w:i w:val="0"/>
-          <w:rtl/>
-        </w:rPr>
-        <w:t>פותחים את האתגר "אפיון העסק שלי במשפט אחד".</w:t>
+        <w:t xml:space="preserve">פעילות: </w:t>
+      </w:r>
+      <w:r>
+        <w:rPr>
+          <w:i w:val="0"/>
+          <w:rtl/>
+        </w:rPr>
+        <w:t>אתגר בצ'אט: "העסק שלי במשפט אחד". בוחרים 3 משפטים חדים ומקריאים אותם.</w:t>
       </w:r>
     </w:p>
     <w:p>
@@ -4901,7 +4894,7 @@
           <w:i w:val="0"/>
           <w:rtl/>
         </w:rPr>
-        <w:t>ובסוף: כתבו באתגר את העסק שלכם במשפט אחד. הכי ברור וחד מנצח.</w:t>
+        <w:t>ובסוף: כתבו בצ'אט את העסק שלכם במשפט אחד. הכי ברור וחד מנצח.</w:t>
       </w:r>
     </w:p>
     <w:p>
@@ -4967,14 +4960,14 @@
           <w:b/>
           <w:rtl/>
         </w:rPr>
-        <w:t xml:space="preserve">אפליקציית הקורס: </w:t>
-      </w:r>
-      <w:r>
-        <w:rPr>
-          <w:i w:val="0"/>
-          <w:rtl/>
-        </w:rPr>
-        <w:t>הצבעה: הנחיית הערב.</w:t>
+        <w:t xml:space="preserve">פעילות: </w:t>
+      </w:r>
+      <w:r>
+        <w:rPr>
+          <w:i w:val="0"/>
+          <w:rtl/>
+        </w:rPr>
+        <w:t>הצבעה בצ'אט: מקריאים 3 הנחיות מועמדות, והכיתה כותבת 1, 2 או 3.</w:t>
       </w:r>
     </w:p>
     <w:p>
@@ -5060,7 +5053,7 @@
           <w:i w:val="0"/>
           <w:rtl/>
         </w:rPr>
-        <w:t>ועכשיו הצבעה: מהי הנחיית הערב? המנצחת נכנסת לבנק של כולם, ואשלח אותה במייל.</w:t>
+        <w:t>ועכשיו הצבעה: מהי הנחיית הערב? אני מקריאה שלוש מועמדות, ואתם כותבים בצ'אט 1, 2 או 3. המנצחת נכנסת לבנק של כולם, ואשלח אותה במייל.</w:t>
       </w:r>
     </w:p>
     <w:p>
@@ -5447,7 +5440,7 @@
           <w:i w:val="0"/>
           <w:rtl/>
         </w:rPr>
-        <w:t>הם בצ'אט, בחוברת, ובארגז הכלים באפליקציה.</w:t>
+        <w:t>הם בצ'אט ובחוברת.</w:t>
       </w:r>
     </w:p>
     <w:p>
@@ -5527,14 +5520,14 @@
           <w:b/>
           <w:rtl/>
         </w:rPr>
-        <w:t xml:space="preserve">אפליקציית הקורס: </w:t>
-      </w:r>
-      <w:r>
-        <w:rPr>
-          <w:i w:val="0"/>
-          <w:rtl/>
-        </w:rPr>
-        <w:t>מציגים את התוצאות הסופיות והמנצחים במשחק.</w:t>
+        <w:t xml:space="preserve">פעילות: </w:t>
+      </w:r>
+      <w:r>
+        <w:rPr>
+          <w:i w:val="0"/>
+          <w:rtl/>
+        </w:rPr>
+        <w:t>משתפים את לוח המובילים של Prompt Lab, ומכריזים גם על הנחיית הערב. גיבוי: אם המשחק לא פעל, מכריזים רק על הנחיית הערב.</w:t>
       </w:r>
     </w:p>
     <w:p>
@@ -5632,7 +5625,7 @@
           <w:color w:val="7A5A00"/>
           <w:rtl/>
         </w:rPr>
-        <w:t>(משתפים את לוח התוצאות ומכריזים על המנצחים)</w:t>
+        <w:t>(משתפים את לוח המובילים של Prompt Lab ומכריזים על המנצחים. אם המשחק לא פעל: מכריזים על הנחיית הערב)</w:t>
       </w:r>
     </w:p>
     <w:p>

</xml_diff>